<commit_message>
Second review round: correct duration wording, align milestone names, define abbreviations
- Replace incorrect '14 weeks' with 74 working days (105 calendar days)
- Align M2, M3, M6 names with triggering deliverables; update Gantt and MS Project file
- Define SOW, TSSA, ESA, POS, SOPs at first use; cite Table 6 in text
- Document soft-dependency decisions (1.2.3, 1.8.1) in Table 4
- Move AI-use statement to APA Author Note; remove blank page; set en-CA language

Co-Authored-By: Claude Sonnet 5.5 <noreply@anthropic.com>
Claude-Session: https://claude.ai/code/session_019ixyddqXjyqDj7N4xYkpSe
</commit_message>
<xml_diff>
--- a/assignment-2/Assignment2_Project_Planning_Group03.docx
+++ b/assignment-2/Assignment2_Project_Planning_Group03.docx
@@ -173,6 +173,65 @@
       </w:r>
     </w:p>
     <w:p>
+      <w:pPr>
+        <w:spacing w:line="480"/>
+        <w:jc w:val="center"/>
+      </w:pPr>
+      <w:r>
+        <w:rPr>
+          <w:rFonts w:ascii="Times New Roman" w:cs="Times New Roman" w:eastAsia="Times New Roman" w:hAnsi="Times New Roman"/>
+          <w:sz w:val="24"/>
+          <w:szCs w:val="24"/>
+        </w:rPr>
+        <w:t xml:space="preserve"/>
+      </w:r>
+    </w:p>
+    <w:p>
+      <w:pPr>
+        <w:spacing w:line="480"/>
+        <w:jc w:val="center"/>
+      </w:pPr>
+      <w:r>
+        <w:rPr>
+          <w:rFonts w:ascii="Times New Roman" w:cs="Times New Roman" w:eastAsia="Times New Roman" w:hAnsi="Times New Roman"/>
+          <w:sz w:val="24"/>
+          <w:szCs w:val="24"/>
+        </w:rPr>
+        <w:t xml:space="preserve"/>
+      </w:r>
+    </w:p>
+    <w:p>
+      <w:pPr>
+        <w:spacing w:line="480"/>
+        <w:jc w:val="center"/>
+      </w:pPr>
+      <w:r>
+        <w:rPr>
+          <w:rFonts w:ascii="Times New Roman" w:cs="Times New Roman" w:eastAsia="Times New Roman" w:hAnsi="Times New Roman"/>
+          <w:b/>
+          <w:bCs/>
+          <w:sz w:val="24"/>
+          <w:szCs w:val="24"/>
+        </w:rPr>
+        <w:t xml:space="preserve">Author Note</w:t>
+      </w:r>
+    </w:p>
+    <w:p>
+      <w:pPr>
+        <w:widowControl/>
+        <w:spacing w:line="480"/>
+        <w:ind w:firstLine="720"/>
+      </w:pPr>
+      <w:r>
+        <w:rPr>
+          <w:rFonts w:ascii="Times New Roman" w:cs="Times New Roman" w:eastAsia="Times New Roman" w:hAnsi="Times New Roman"/>
+          <w:sz w:val="24"/>
+          <w:szCs w:val="24"/>
+        </w:rPr>
+        <w:t xml:space="preserve">An AI assistant (Claude, developed by Anthropic) was used to cross-check the schedule calculations, generate the diagrams and the Microsoft Project file, and edit the text. The activities, dependencies, and project context come from the group’s Assignment 1 work, and the team reviewed all content before submission.</w:t>
+      </w:r>
+    </w:p>
+    <w:p>
       <w:r>
         <w:br w:type="page"/>
       </w:r>
@@ -206,7 +265,7 @@
           <w:sz w:val="24"/>
           <w:szCs w:val="24"/>
         </w:rPr>
-        <w:t xml:space="preserve">This report presents the planning baseline for SOW Enterprise’s project to launch a food truck service in London, Ontario. It builds on the Statement of Work prepared in Assignment 1, which set a 14-week window (September 8 to December 21, 2026), nine milestones, and a high-level budget (Group 03, 2026a). In line with Project Management Institute (PMI, 2021) practice, the scope was decomposed into a work breakdown structure (WBS), the deliverables were sequenced in a network diagram, and estimated durations were applied to produce a Gantt chart, a milestone plan, and the critical path.</w:t>
+        <w:t xml:space="preserve">This report presents the planning baseline for SOW Enterprise’s project to launch a food truck service in London, Ontario. It builds on the Statement of Work (SOW) prepared in Assignment 1, which set a project window from September 8 to December 21, 2026, nine milestones, and a high-level budget (Group 03, 2026a). In line with Project Management Institute (PMI, 2021) practice, the scope was decomposed into a work breakdown structure (WBS), the deliverables were sequenced in a network diagram, and estimated durations were applied to produce a Gantt chart, a milestone plan, and the critical path.</w:t>
       </w:r>
     </w:p>
     <w:p>
@@ -221,7 +280,7 @@
           <w:sz w:val="24"/>
           <w:szCs w:val="24"/>
         </w:rPr>
-        <w:t xml:space="preserve">The plan reuses the group’s Assignment 1 activity list and interdependency analysis (Group 03, 2026b, 2026c). The 20 numbered activities from that list are cross-referenced in Table 2, so every deliverable can be traced to the earlier work. Table 1 summarizes the resulting baseline.</w:t>
+        <w:t xml:space="preserve">The plan reuses the group’s Assignment 1 activity list and interdependency analysis (Group 03, 2026b, 2026c). Table 1 summarizes the resulting baseline. The 20 numbered activities from the earlier list are cross-referenced in Table 2, so every deliverable can be traced to the earlier work.</w:t>
       </w:r>
     </w:p>
     <w:p>
@@ -558,7 +617,7 @@
                 <w:sz w:val="19"/>
                 <w:szCs w:val="19"/>
               </w:rPr>
-              <w:t xml:space="preserve">74 working days (14 weeks)</w:t>
+              <w:t xml:space="preserve">74 working days (105 calendar days)</w:t>
             </w:r>
           </w:p>
         </w:tc>
@@ -5737,7 +5796,7 @@
           <w:sz w:val="20"/>
           <w:szCs w:val="20"/>
         </w:rPr>
-        <w:t xml:space="preserve">Source gives the numbered activity in the group’s activity list (Group 03, 2026b) or, for 1.1.1 and 1.1.2, the Statement of Work (SOW) phase. Included outputs follow the group’s WBS (Group 03, 2026c).</w:t>
+        <w:t xml:space="preserve">Source gives the numbered activity in the group’s activity list (Group 03, 2026b) or, for 1.1.1 and 1.1.2, the Statement of Work (SOW) phase. Included outputs follow the group’s WBS (Group 03, 2026c). POS = point of sale.</w:t>
       </w:r>
     </w:p>
     <w:p>
@@ -9041,7 +9100,7 @@
                 <w:sz w:val="18"/>
                 <w:szCs w:val="18"/>
               </w:rPr>
-              <w:t xml:space="preserve">Compliance documents are verified as staffing profiles take shape (SS+5d).</w:t>
+              <w:t xml:space="preserve">Documents are verified as staffing profiles take shape (SS+5d). Assignment 1 linked staffing and compliance both ways; the link is one-way here to avoid circular logic.</w:t>
             </w:r>
           </w:p>
         </w:tc>
@@ -9178,7 +9237,7 @@
                 <w:sz w:val="18"/>
                 <w:szCs w:val="18"/>
               </w:rPr>
-              <w:t xml:space="preserve">Branding needs the approved layout (service windows) and cannot finish before the menu display content (FF).</w:t>
+              <w:t xml:space="preserve">Branding needs the approved layout (service windows) and cannot finish before the menu is approved (FF), because menu displays use its content.</w:t>
             </w:r>
           </w:p>
         </w:tc>
@@ -9452,7 +9511,7 @@
                 <w:sz w:val="18"/>
                 <w:szCs w:val="18"/>
               </w:rPr>
-              <w:t xml:space="preserve">Commercial outreach starts once operating requirements and constraints are validated.</w:t>
+              <w:t xml:space="preserve">Outreach starts once operating requirements are validated. The soft link from promotion (1.7.2) in Assignment 1 is not scheduled as a constraint.</w:t>
             </w:r>
           </w:p>
         </w:tc>
@@ -9941,7 +10000,7 @@
           <w:sz w:val="24"/>
           <w:szCs w:val="24"/>
         </w:rPr>
-        <w:t xml:space="preserve">Figure 3 presents the schedule, built from the WBS and the links in Table 4. All 22 deliverables are scheduled on a Monday-to-Friday, 8-hour calendar that treats Thanksgiving Day (October 12, 2026) as non-working, and the nine level-2 elements roll up as summary tasks. The plan runs from September 8 to December 21, 2026, a total of 74 working days (14 weeks).</w:t>
+        <w:t xml:space="preserve">Figure 3 presents the schedule, built from the WBS and the links in Table 4. All 22 deliverables are scheduled on a Monday-to-Friday, 8-hour calendar that treats Thanksgiving Day (October 12, 2026) as non-working, and the nine level-2 elements roll up as summary tasks. The plan runs from September 8 to December 21, 2026, a total of 74 working days (105 calendar days). Nine milestones (M1 to M9) mark the key decision points; Table 6 lists them.</w:t>
       </w:r>
     </w:p>
     <w:p>
@@ -9956,7 +10015,7 @@
           <w:sz w:val="24"/>
           <w:szCs w:val="24"/>
         </w:rPr>
-        <w:t xml:space="preserve">Durations are the team’s expert-judgment estimates in working days. They are based on the Assignment 1 phase plan, the scope of each deliverable, and the external lead times (municipal, health, fire, TSSA, and ESA approvals) that Assignment 1 assumed would be met (Group 03, 2026a). Table 5 gives each deliverable’s duration, dates, predecessors, and total float. The schedule rests on these assumptions:</w:t>
+        <w:t xml:space="preserve">Durations are the team’s expert-judgment estimates in working days. They are based on the Assignment 1 phase plan, the scope of each deliverable, and the external lead times (municipal, health, fire, Technical Standards and Safety Authority [TSSA], and Electrical Safety Authority [ESA] approvals) that Assignment 1 assumed would be met (Group 03, 2026a). Table 5 gives each deliverable’s duration, dates, predecessors, and total float. The schedule rests on these assumptions:</w:t>
       </w:r>
     </w:p>
     <w:p>
@@ -17877,7 +17936,7 @@
                 <w:sz w:val="19"/>
                 <w:szCs w:val="19"/>
               </w:rPr>
-              <w:t xml:space="preserve">Compliance path and budget confirmed</w:t>
+              <w:t xml:space="preserve">Compliance path confirmed</w:t>
             </w:r>
           </w:p>
         </w:tc>
@@ -18080,7 +18139,7 @@
                 <w:sz w:val="19"/>
                 <w:szCs w:val="19"/>
               </w:rPr>
-              <w:t xml:space="preserve">Trailer delivered; equipment and fit-out contracted</w:t>
+              <w:t xml:space="preserve">Trailer and equipment acquired</w:t>
             </w:r>
           </w:p>
         </w:tc>
@@ -18689,7 +18748,7 @@
                 <w:sz w:val="19"/>
                 <w:szCs w:val="19"/>
               </w:rPr>
-              <w:t xml:space="preserve">Staff trained; compliance documents filed</w:t>
+              <w:t xml:space="preserve">Staff trained; compliance package complete</w:t>
             </w:r>
           </w:p>
         </w:tc>
@@ -19456,7 +19515,7 @@
           <w:sz w:val="20"/>
           <w:szCs w:val="20"/>
         </w:rPr>
-        <w:t xml:space="preserve">Triggered by lists the deliverable (or deliverables) whose completion triggers the milestone; M7 is triggered seven working days after 1.9.1 starts. Milestone wording was aligned with the triggering deliverables: M2 (Assignment 1: compliance path, budget and event pipeline confirmed), M4 (unit commissioned), M5 (menu, pricing and SOPs frozen), and M6 (staff trained; health notices filed).</w:t>
+        <w:t xml:space="preserve">Triggered by lists the deliverable (or deliverables) whose completion triggers the milestone; M7 is triggered seven working days after 1.9.1 starts. Milestone wording was aligned with the triggering deliverables. The Assignment 1 wording was: M2, compliance path, budget and event pipeline confirmed; M3, trailer shell delivered, equipment and fit-out contracted; M4, unit commissioned; M5, menu, pricing and standard operating procedures (SOPs) frozen; and M6, staff trained and health notices filed.</w:t>
       </w:r>
     </w:p>
     <w:p>
@@ -21899,44 +21958,7 @@
       <w:pPr>
         <w:pStyle w:val="Heading1"/>
         <w:keepNext/>
-        <w:spacing w:line="480"/>
-        <w:jc w:val="center"/>
-      </w:pPr>
-      <w:r>
-        <w:rPr>
-          <w:rFonts w:ascii="Times New Roman" w:cs="Times New Roman" w:eastAsia="Times New Roman" w:hAnsi="Times New Roman"/>
-          <w:b/>
-          <w:bCs/>
-          <w:sz w:val="24"/>
-          <w:szCs w:val="24"/>
-        </w:rPr>
-        <w:t xml:space="preserve">AI Use Disclosure</w:t>
-      </w:r>
-    </w:p>
-    <w:p>
-      <w:pPr>
-        <w:widowControl/>
-        <w:spacing w:line="480"/>
-        <w:ind w:firstLine="720"/>
-      </w:pPr>
-      <w:r>
-        <w:rPr>
-          <w:rFonts w:ascii="Times New Roman" w:cs="Times New Roman" w:eastAsia="Times New Roman" w:hAnsi="Times New Roman"/>
-          <w:sz w:val="24"/>
-          <w:szCs w:val="24"/>
-        </w:rPr>
-        <w:t xml:space="preserve">An AI assistant (Claude, developed by Anthropic) was used to cross-check the schedule calculations, generate the diagrams and the Microsoft Project file, and edit the text. The activities, dependencies, and project context come from the group’s Assignment 1 work, and the team reviewed all content before submission.</w:t>
-      </w:r>
-    </w:p>
-    <w:p>
-      <w:r>
-        <w:br w:type="page"/>
-      </w:r>
-    </w:p>
-    <w:p>
-      <w:pPr>
-        <w:pStyle w:val="Heading1"/>
-        <w:keepNext/>
+        <w:pageBreakBefore/>
         <w:spacing w:line="480"/>
         <w:jc w:val="center"/>
       </w:pPr>
@@ -22479,6 +22501,7 @@
         <w:rFonts w:ascii="Times New Roman" w:cs="Times New Roman" w:eastAsia="Times New Roman" w:hAnsi="Times New Roman"/>
         <w:sz w:val="24"/>
         <w:szCs w:val="24"/>
+        <w:lang w:val="en-CA"/>
       </w:rPr>
     </w:rPrDefault>
     <w:pPrDefault/>

</xml_diff>

<commit_message>
Verify references, summarize AI disclosure, correct duration attribution
- Author Note now summarizes AI use across all four stages of the project
- Group 03 references reformatted as unpublished manuscripts with cover titles
- Remove claim that durations were team estimates (AI proposed; group to confirm)

Co-Authored-By: Claude Sonnet 5.5 <noreply@anthropic.com>
Claude-Session: https://claude.ai/code/session_019ixyddqXjyqDj7N4xYkpSe
</commit_message>
<xml_diff>
--- a/assignment-2/Assignment2_Project_Planning_Group03.docx
+++ b/assignment-2/Assignment2_Project_Planning_Group03.docx
@@ -2,34 +2,6 @@
 <file path=word/document.xml><?xml version="1.0" encoding="utf-8"?>
 <w:document xmlns:wpc="http://schemas.microsoft.com/office/word/2010/wordprocessingCanvas" xmlns:mc="http://schemas.openxmlformats.org/markup-compatibility/2006" xmlns:o="urn:schemas-microsoft-com:office:office" xmlns:r="http://schemas.openxmlformats.org/officeDocument/2006/relationships" xmlns:m="http://schemas.openxmlformats.org/officeDocument/2006/math" xmlns:v="urn:schemas-microsoft-com:vml" xmlns:wp14="http://schemas.microsoft.com/office/word/2010/wordprocessingDrawing" xmlns:wp="http://schemas.openxmlformats.org/drawingml/2006/wordprocessingDrawing" xmlns:w10="urn:schemas-microsoft-com:office:word" xmlns:w="http://schemas.openxmlformats.org/wordprocessingml/2006/main" xmlns:w14="http://schemas.microsoft.com/office/word/2010/wordml" xmlns:w15="http://schemas.microsoft.com/office/word/2012/wordml" xmlns:wpg="http://schemas.microsoft.com/office/word/2010/wordprocessingGroup" xmlns:wpi="http://schemas.microsoft.com/office/word/2010/wordprocessingInk" xmlns:wne="http://schemas.microsoft.com/office/word/2006/wordml" xmlns:wps="http://schemas.microsoft.com/office/word/2010/wordprocessingShape" xmlns:cx="http://schemas.microsoft.com/office/drawing/2014/chartex" xmlns:cx1="http://schemas.microsoft.com/office/drawing/2015/9/8/chartex" xmlns:cx2="http://schemas.microsoft.com/office/drawing/2015/10/21/chartex" xmlns:cx3="http://schemas.microsoft.com/office/drawing/2016/5/9/chartex" xmlns:cx4="http://schemas.microsoft.com/office/drawing/2016/5/10/chartex" xmlns:cx5="http://schemas.microsoft.com/office/drawing/2016/5/11/chartex" xmlns:cx6="http://schemas.microsoft.com/office/drawing/2016/5/12/chartex" xmlns:cx7="http://schemas.microsoft.com/office/drawing/2016/5/13/chartex" xmlns:cx8="http://schemas.microsoft.com/office/drawing/2016/5/14/chartex" xmlns:aink="http://schemas.microsoft.com/office/drawing/2016/ink" xmlns:am3d="http://schemas.microsoft.com/office/drawing/2017/model3d" xmlns:w16cex="http://schemas.microsoft.com/office/word/2018/wordml/cex" xmlns:w16cid="http://schemas.microsoft.com/office/word/2016/wordml/cid" xmlns:w16="http://schemas.microsoft.com/office/word/2018/wordml" xmlns:w16sdtdh="http://schemas.microsoft.com/office/word/2020/wordml/sdtdatahash" xmlns:w16se="http://schemas.microsoft.com/office/word/2015/wordml/symex" mc:Ignorable="w14 w15 wp14">
   <w:body>
-    <w:p>
-      <w:pPr>
-        <w:spacing w:line="480"/>
-        <w:jc w:val="center"/>
-      </w:pPr>
-      <w:r>
-        <w:rPr>
-          <w:rFonts w:ascii="Times New Roman" w:cs="Times New Roman" w:eastAsia="Times New Roman" w:hAnsi="Times New Roman"/>
-          <w:sz w:val="24"/>
-          <w:szCs w:val="24"/>
-        </w:rPr>
-        <w:t xml:space="preserve"/>
-      </w:r>
-    </w:p>
-    <w:p>
-      <w:pPr>
-        <w:spacing w:line="480"/>
-        <w:jc w:val="center"/>
-      </w:pPr>
-      <w:r>
-        <w:rPr>
-          <w:rFonts w:ascii="Times New Roman" w:cs="Times New Roman" w:eastAsia="Times New Roman" w:hAnsi="Times New Roman"/>
-          <w:sz w:val="24"/>
-          <w:szCs w:val="24"/>
-        </w:rPr>
-        <w:t xml:space="preserve"/>
-      </w:r>
-    </w:p>
     <w:p>
       <w:pPr>
         <w:spacing w:line="480"/>
@@ -188,21 +160,7 @@
     </w:p>
     <w:p>
       <w:pPr>
-        <w:spacing w:line="480"/>
-        <w:jc w:val="center"/>
-      </w:pPr>
-      <w:r>
-        <w:rPr>
-          <w:rFonts w:ascii="Times New Roman" w:cs="Times New Roman" w:eastAsia="Times New Roman" w:hAnsi="Times New Roman"/>
-          <w:sz w:val="24"/>
-          <w:szCs w:val="24"/>
-        </w:rPr>
-        <w:t xml:space="preserve"/>
-      </w:r>
-    </w:p>
-    <w:p>
-      <w:pPr>
-        <w:spacing w:line="480"/>
+        <w:spacing w:after="120" w:line="360"/>
         <w:jc w:val="center"/>
       </w:pPr>
       <w:r>
@@ -218,17 +176,127 @@
     </w:p>
     <w:p>
       <w:pPr>
-        <w:widowControl/>
-        <w:spacing w:line="480"/>
-        <w:ind w:firstLine="720"/>
+        <w:spacing w:after="80" w:line="276"/>
       </w:pPr>
       <w:r>
         <w:rPr>
           <w:rFonts w:ascii="Times New Roman" w:cs="Times New Roman" w:eastAsia="Times New Roman" w:hAnsi="Times New Roman"/>
-          <w:sz w:val="24"/>
-          <w:szCs w:val="24"/>
+          <w:sz w:val="22"/>
+          <w:szCs w:val="22"/>
         </w:rPr>
-        <w:t xml:space="preserve">An AI assistant (Claude, developed by Anthropic) was used to cross-check the schedule calculations, generate the diagrams and the Microsoft Project file, and edit the text. The activities, dependencies, and project context come from the group’s Assignment 1 work, and the team reviewed all content before submission.</w:t>
+        <w:t xml:space="preserve">Generative AI was used as a support tool at four stages of this project. The group supplied the operational knowledge, assumptions, and activity content, and the group reviewed and approved the final content before submission.</w:t>
+      </w:r>
+    </w:p>
+    <w:p>
+      <w:pPr>
+        <w:pStyle w:val="ListParagraph"/>
+        <w:numPr>
+          <w:ilvl w:val="0"/>
+          <w:numId w:val="2"/>
+        </w:numPr>
+        <w:spacing w:after="60" w:line="276"/>
+      </w:pPr>
+      <w:r>
+        <w:rPr>
+          <w:rFonts w:ascii="Times New Roman" w:cs="Times New Roman" w:eastAsia="Times New Roman" w:hAnsi="Times New Roman"/>
+          <w:b/>
+          <w:bCs/>
+          <w:sz w:val="22"/>
+          <w:szCs w:val="22"/>
+        </w:rPr>
+        <w:t xml:space="preserve">Assignment 1 (statement of work). </w:t>
+      </w:r>
+      <w:r>
+        <w:rPr>
+          <w:rFonts w:ascii="Times New Roman" w:cs="Times New Roman" w:eastAsia="Times New Roman" w:hAnsi="Times New Roman"/>
+          <w:sz w:val="22"/>
+          <w:szCs w:val="22"/>
+        </w:rPr>
+        <w:t xml:space="preserve">ChatGPT supported brainstorming, organizing information, and improving the clarity and grammar of the text (Group 03, 2026a).</w:t>
+      </w:r>
+    </w:p>
+    <w:p>
+      <w:pPr>
+        <w:pStyle w:val="ListParagraph"/>
+        <w:numPr>
+          <w:ilvl w:val="0"/>
+          <w:numId w:val="2"/>
+        </w:numPr>
+        <w:spacing w:after="60" w:line="276"/>
+      </w:pPr>
+      <w:r>
+        <w:rPr>
+          <w:rFonts w:ascii="Times New Roman" w:cs="Times New Roman" w:eastAsia="Times New Roman" w:hAnsi="Times New Roman"/>
+          <w:b/>
+          <w:bCs/>
+          <w:sz w:val="22"/>
+          <w:szCs w:val="22"/>
+        </w:rPr>
+        <w:t xml:space="preserve">Activity list and interdependencies. </w:t>
+      </w:r>
+      <w:r>
+        <w:rPr>
+          <w:rFonts w:ascii="Times New Roman" w:cs="Times New Roman" w:eastAsia="Times New Roman" w:hAnsi="Times New Roman"/>
+          <w:sz w:val="22"/>
+          <w:szCs w:val="22"/>
+        </w:rPr>
+        <w:t xml:space="preserve">An AI assistant helped group, sequence, and clarify the group’s activities in project-management terms and separate one-time from recurring dependencies. It was not asked to invent the project (Group 03, 2026b).</w:t>
+      </w:r>
+    </w:p>
+    <w:p>
+      <w:pPr>
+        <w:pStyle w:val="ListParagraph"/>
+        <w:numPr>
+          <w:ilvl w:val="0"/>
+          <w:numId w:val="2"/>
+        </w:numPr>
+        <w:spacing w:after="60" w:line="276"/>
+      </w:pPr>
+      <w:r>
+        <w:rPr>
+          <w:rFonts w:ascii="Times New Roman" w:cs="Times New Roman" w:eastAsia="Times New Roman" w:hAnsi="Times New Roman"/>
+          <w:b/>
+          <w:bCs/>
+          <w:sz w:val="22"/>
+          <w:szCs w:val="22"/>
+        </w:rPr>
+        <w:t xml:space="preserve">Work breakdown structure. </w:t>
+      </w:r>
+      <w:r>
+        <w:rPr>
+          <w:rFonts w:ascii="Times New Roman" w:cs="Times New Roman" w:eastAsia="Times New Roman" w:hAnsi="Times New Roman"/>
+          <w:sz w:val="22"/>
+          <w:szCs w:val="22"/>
+        </w:rPr>
+        <w:t xml:space="preserve">An AI assistant reviewed the group’s draft against the statement of work, the activity list, and the rubric (grouping, code consistency, at least 20 work packages, gaps, and unclear wording) and explained its suggestions. The group decided what to revise (Group 03, 2026c).</w:t>
+      </w:r>
+    </w:p>
+    <w:p>
+      <w:pPr>
+        <w:pStyle w:val="ListParagraph"/>
+        <w:numPr>
+          <w:ilvl w:val="0"/>
+          <w:numId w:val="2"/>
+        </w:numPr>
+        <w:spacing w:after="60" w:line="276"/>
+      </w:pPr>
+      <w:r>
+        <w:rPr>
+          <w:rFonts w:ascii="Times New Roman" w:cs="Times New Roman" w:eastAsia="Times New Roman" w:hAnsi="Times New Roman"/>
+          <w:b/>
+          <w:bCs/>
+          <w:sz w:val="22"/>
+          <w:szCs w:val="22"/>
+        </w:rPr>
+        <w:t xml:space="preserve">Assignment 2 schedule and report. </w:t>
+      </w:r>
+      <w:r>
+        <w:rPr>
+          <w:rFonts w:ascii="Times New Roman" w:cs="Times New Roman" w:eastAsia="Times New Roman" w:hAnsi="Times New Roman"/>
+          <w:sz w:val="22"/>
+          <w:szCs w:val="22"/>
+        </w:rPr>
+        <w:t xml:space="preserve">Claude (Anthropic) proposed the activity durations and link types for the group to confirm, calculated the dates, float, and critical path (checked with a second, independent calculation), generated the network diagram, Gantt chart, and Microsoft Project file, and edited the report text.</w:t>
       </w:r>
     </w:p>
     <w:p>
@@ -10015,7 +10083,7 @@
           <w:sz w:val="24"/>
           <w:szCs w:val="24"/>
         </w:rPr>
-        <w:t xml:space="preserve">Durations are the team’s expert-judgment estimates in working days. They are based on the Assignment 1 phase plan, the scope of each deliverable, and the external lead times (municipal, health, fire, Technical Standards and Safety Authority [TSSA], and Electrical Safety Authority [ESA] approvals) that Assignment 1 assumed would be met (Group 03, 2026a). Table 5 gives each deliverable’s duration, dates, predecessors, and total float. The schedule rests on these assumptions:</w:t>
+        <w:t xml:space="preserve">Durations are estimates in working days. They are based on the Assignment 1 phase plan, the scope of each deliverable, and the external lead times (municipal, health, fire, Technical Standards and Safety Authority [TSSA], and Electrical Safety Authority [ESA] approvals) that Assignment 1 assumed would be met (Group 03, 2026a). Table 5 gives each deliverable’s duration, dates, predecessors, and total float. The schedule rests on these assumptions:</w:t>
       </w:r>
     </w:p>
     <w:p>
@@ -21994,7 +22062,7 @@
           <w:sz w:val="24"/>
           <w:szCs w:val="24"/>
         </w:rPr>
-        <w:t xml:space="preserve">Assignment 1: SOW Enterprise – Statement of work for launching a food truck in London, Ontario</w:t>
+        <w:t xml:space="preserve">Assignment 1: SOW Enterprise</w:t>
       </w:r>
       <w:r>
         <w:rPr>
@@ -22002,7 +22070,7 @@
           <w:sz w:val="24"/>
           <w:szCs w:val="24"/>
         </w:rPr>
-        <w:t xml:space="preserve"> [Unpublished course assignment]. Fanshawe College.</w:t>
+        <w:t xml:space="preserve"> [Unpublished manuscript]. Fanshawe College.</w:t>
       </w:r>
     </w:p>
     <w:p>
@@ -22034,7 +22102,7 @@
           <w:sz w:val="24"/>
           <w:szCs w:val="24"/>
         </w:rPr>
-        <w:t xml:space="preserve"> [Unpublished course document]. Fanshawe College.</w:t>
+        <w:t xml:space="preserve"> [Unpublished manuscript]. Fanshawe College.</w:t>
       </w:r>
     </w:p>
     <w:p>
@@ -22066,7 +22134,7 @@
           <w:sz w:val="24"/>
           <w:szCs w:val="24"/>
         </w:rPr>
-        <w:t xml:space="preserve"> [Unpublished course document]. Fanshawe College.</w:t>
+        <w:t xml:space="preserve"> [Unpublished manuscript]. Fanshawe College.</w:t>
       </w:r>
     </w:p>
     <w:p>

</xml_diff>